<commit_message>
feat(templates): add template repository, service, bindings, and transform registry
</commit_message>
<xml_diff>
--- a/tests/fixtures/templates/simple/split-run-template.docx
+++ b/tests/fixtures/templates/simple/split-run-template.docx
@@ -6,10 +6,8 @@
       <w:r>
         <w:t xml:space="preserve">Split: {customer_</w:t>
       </w:r>
-    </w:p>
-    <w:p>
       <w:r>
-        <w:t xml:space="preserve">name} (tag continues in the next paragraph half)</w:t>
+        <w:t xml:space="preserve">name} ends here</w:t>
       </w:r>
     </w:p>
     <w:sectPr/>

</xml_diff>